<commit_message>
Update report: add BITS ID, remove References section
</commit_message>
<xml_diff>
--- a/REPORT.docx
+++ b/REPORT.docx
@@ -28,7 +28,7 @@
         </w:p>
       </w:sdtContent>
     </w:sdt>
-    <w:bookmarkStart w:id="68" w:name="mlops-assignment-report"/>
+    <w:bookmarkStart w:id="67" w:name="mlops-assignment-report"/>
     <w:p>
       <w:pPr>
         <w:pStyle w:val="Heading1"/>
@@ -88,10 +88,10 @@
           <w:b/>
           <w:bCs/>
         </w:rPr>
-        <w:t xml:space="preserve">Total Marks</w:t>
-      </w:r>
-      <w:r>
-        <w:t xml:space="preserve">: 50</w:t>
+        <w:t xml:space="preserve">BITS ID</w:t>
+      </w:r>
+      <w:r>
+        <w:t xml:space="preserve">: 2025cs05001</w:t>
       </w:r>
     </w:p>
     <w:p>
@@ -312,23 +312,6 @@
             <w:rStyle w:val="Hyperlink"/>
           </w:rPr>
           <w:t xml:space="preserve">Conclusion</w:t>
-        </w:r>
-      </w:hyperlink>
-    </w:p>
-    <w:p>
-      <w:pPr>
-        <w:pStyle w:val="Compact"/>
-        <w:numPr>
-          <w:ilvl w:val="0"/>
-          <w:numId w:val="1001"/>
-        </w:numPr>
-      </w:pPr>
-      <w:hyperlink w:anchor="X8241e2c2f4870e183c18f4839d5b00887fbb26d">
-        <w:r>
-          <w:rPr>
-            <w:rStyle w:val="Hyperlink"/>
-          </w:rPr>
-          <w:t xml:space="preserve">References</w:t>
         </w:r>
       </w:hyperlink>
     </w:p>
@@ -7653,13 +7636,169 @@
     </w:p>
     <w:bookmarkEnd w:id="62"/>
     <w:bookmarkEnd w:id="63"/>
-    <w:bookmarkStart w:id="64" w:name="references"/>
+    <w:bookmarkStart w:id="66" w:name="appendix"/>
     <w:p>
       <w:pPr>
         <w:pStyle w:val="Heading2"/>
       </w:pPr>
       <w:r>
-        <w:t xml:space="preserve">13. References</w:t>
+        <w:t xml:space="preserve">Appendix</w:t>
+      </w:r>
+    </w:p>
+    <w:bookmarkStart w:id="64" w:name="a.-repository-structure"/>
+    <w:p>
+      <w:pPr>
+        <w:pStyle w:val="Heading3"/>
+      </w:pPr>
+      <w:r>
+        <w:t xml:space="preserve">A. Repository Structure</w:t>
+      </w:r>
+    </w:p>
+    <w:p>
+      <w:pPr>
+        <w:pStyle w:val="SourceCode"/>
+      </w:pPr>
+      <w:r>
+        <w:rPr>
+          <w:rStyle w:val="VerbatimChar"/>
+        </w:rPr>
+        <w:t xml:space="preserve">MLOps_assignment_2025cs05001/</w:t>
+      </w:r>
+      <w:r>
+        <w:br/>
+      </w:r>
+      <w:r>
+        <w:rPr>
+          <w:rStyle w:val="VerbatimChar"/>
+        </w:rPr>
+        <w:t xml:space="preserve">├── .github/workflows/ci-cd.yml</w:t>
+      </w:r>
+      <w:r>
+        <w:br/>
+      </w:r>
+      <w:r>
+        <w:rPr>
+          <w:rStyle w:val="VerbatimChar"/>
+        </w:rPr>
+        <w:t xml:space="preserve">├── api/</w:t>
+      </w:r>
+      <w:r>
+        <w:br/>
+      </w:r>
+      <w:r>
+        <w:rPr>
+          <w:rStyle w:val="VerbatimChar"/>
+        </w:rPr>
+        <w:t xml:space="preserve">├── data/</w:t>
+      </w:r>
+      <w:r>
+        <w:br/>
+      </w:r>
+      <w:r>
+        <w:rPr>
+          <w:rStyle w:val="VerbatimChar"/>
+        </w:rPr>
+        <w:t xml:space="preserve">├── deployment/</w:t>
+      </w:r>
+      <w:r>
+        <w:br/>
+      </w:r>
+      <w:r>
+        <w:rPr>
+          <w:rStyle w:val="VerbatimChar"/>
+        </w:rPr>
+        <w:t xml:space="preserve">├── models/</w:t>
+      </w:r>
+      <w:r>
+        <w:br/>
+      </w:r>
+      <w:r>
+        <w:rPr>
+          <w:rStyle w:val="VerbatimChar"/>
+        </w:rPr>
+        <w:t xml:space="preserve">├── notebooks/</w:t>
+      </w:r>
+      <w:r>
+        <w:br/>
+      </w:r>
+      <w:r>
+        <w:rPr>
+          <w:rStyle w:val="VerbatimChar"/>
+        </w:rPr>
+        <w:t xml:space="preserve">├── screenshots/</w:t>
+      </w:r>
+      <w:r>
+        <w:br/>
+      </w:r>
+      <w:r>
+        <w:rPr>
+          <w:rStyle w:val="VerbatimChar"/>
+        </w:rPr>
+        <w:t xml:space="preserve">├── src/</w:t>
+      </w:r>
+      <w:r>
+        <w:br/>
+      </w:r>
+      <w:r>
+        <w:rPr>
+          <w:rStyle w:val="VerbatimChar"/>
+        </w:rPr>
+        <w:t xml:space="preserve">├── tests/</w:t>
+      </w:r>
+      <w:r>
+        <w:br/>
+      </w:r>
+      <w:r>
+        <w:rPr>
+          <w:rStyle w:val="VerbatimChar"/>
+        </w:rPr>
+        <w:t xml:space="preserve">├── Dockerfile</w:t>
+      </w:r>
+      <w:r>
+        <w:br/>
+      </w:r>
+      <w:r>
+        <w:rPr>
+          <w:rStyle w:val="VerbatimChar"/>
+        </w:rPr>
+        <w:t xml:space="preserve">├── docker-compose.yml</w:t>
+      </w:r>
+      <w:r>
+        <w:br/>
+      </w:r>
+      <w:r>
+        <w:rPr>
+          <w:rStyle w:val="VerbatimChar"/>
+        </w:rPr>
+        <w:t xml:space="preserve">├── README.md</w:t>
+      </w:r>
+      <w:r>
+        <w:br/>
+      </w:r>
+      <w:r>
+        <w:rPr>
+          <w:rStyle w:val="VerbatimChar"/>
+        </w:rPr>
+        <w:t xml:space="preserve">├── REPORT.md</w:t>
+      </w:r>
+      <w:r>
+        <w:br/>
+      </w:r>
+      <w:r>
+        <w:rPr>
+          <w:rStyle w:val="VerbatimChar"/>
+        </w:rPr>
+        <w:t xml:space="preserve">└── requirements.txt</w:t>
+      </w:r>
+    </w:p>
+    <w:bookmarkEnd w:id="64"/>
+    <w:bookmarkStart w:id="65" w:name="b.-links"/>
+    <w:p>
+      <w:pPr>
+        <w:pStyle w:val="Heading3"/>
+      </w:pPr>
+      <w:r>
+        <w:t xml:space="preserve">B. Links</w:t>
       </w:r>
     </w:p>
     <w:p>
@@ -7671,7 +7810,14 @@
         </w:numPr>
       </w:pPr>
       <w:r>
-        <w:t xml:space="preserve">UCI Machine Learning Repository - Heart Disease Dataset</w:t>
+        <w:rPr>
+          <w:b/>
+          <w:bCs/>
+        </w:rPr>
+        <w:t xml:space="preserve">Repository</w:t>
+      </w:r>
+      <w:r>
+        <w:t xml:space="preserve">: https://github.com/gaur-samal/MLOps_assignment_2025cs05001</w:t>
       </w:r>
     </w:p>
     <w:p>
@@ -7683,7 +7829,14 @@
         </w:numPr>
       </w:pPr>
       <w:r>
-        <w:t xml:space="preserve">MLflow Documentation - https://mlflow.org/docs/latest/index.html</w:t>
+        <w:rPr>
+          <w:b/>
+          <w:bCs/>
+        </w:rPr>
+        <w:t xml:space="preserve">CI/CD Pipeline</w:t>
+      </w:r>
+      <w:r>
+        <w:t xml:space="preserve">: https://github.com/gaur-samal/MLOps_assignment_2025cs05001/actions</w:t>
       </w:r>
     </w:p>
     <w:p>
@@ -7695,7 +7848,14 @@
         </w:numPr>
       </w:pPr>
       <w:r>
-        <w:t xml:space="preserve">FastAPI Documentation - https://fastapi.tiangolo.com/</w:t>
+        <w:rPr>
+          <w:b/>
+          <w:bCs/>
+        </w:rPr>
+        <w:t xml:space="preserve">API Documentation</w:t>
+      </w:r>
+      <w:r>
+        <w:t xml:space="preserve">: http://localhost:8000/docs</w:t>
       </w:r>
     </w:p>
     <w:p>
@@ -7707,19 +7867,14 @@
         </w:numPr>
       </w:pPr>
       <w:r>
-        <w:t xml:space="preserve">Kubernetes Documentation - https://kubernetes.io/docs/</w:t>
-      </w:r>
-    </w:p>
-    <w:p>
-      <w:pPr>
-        <w:pStyle w:val="Compact"/>
-        <w:numPr>
-          <w:ilvl w:val="0"/>
-          <w:numId w:val="1011"/>
-        </w:numPr>
-      </w:pPr>
-      <w:r>
-        <w:t xml:space="preserve">Docker Best Practices - https://docs.docker.com/develop/develop-images/dockerfile_best-practices/</w:t>
+        <w:rPr>
+          <w:b/>
+          <w:bCs/>
+        </w:rPr>
+        <w:t xml:space="preserve">MLflow UI</w:t>
+      </w:r>
+      <w:r>
+        <w:t xml:space="preserve">: http://localhost:5000</w:t>
       </w:r>
     </w:p>
     <w:p>
@@ -7729,255 +7884,6 @@
         </w:pict>
       </w:r>
     </w:p>
-    <w:bookmarkEnd w:id="64"/>
-    <w:bookmarkStart w:id="67" w:name="appendix"/>
-    <w:p>
-      <w:pPr>
-        <w:pStyle w:val="Heading2"/>
-      </w:pPr>
-      <w:r>
-        <w:t xml:space="preserve">Appendix</w:t>
-      </w:r>
-    </w:p>
-    <w:bookmarkStart w:id="65" w:name="a.-repository-structure"/>
-    <w:p>
-      <w:pPr>
-        <w:pStyle w:val="Heading3"/>
-      </w:pPr>
-      <w:r>
-        <w:t xml:space="preserve">A. Repository Structure</w:t>
-      </w:r>
-    </w:p>
-    <w:p>
-      <w:pPr>
-        <w:pStyle w:val="SourceCode"/>
-      </w:pPr>
-      <w:r>
-        <w:rPr>
-          <w:rStyle w:val="VerbatimChar"/>
-        </w:rPr>
-        <w:t xml:space="preserve">MLOps_assignment_2025cs05001/</w:t>
-      </w:r>
-      <w:r>
-        <w:br/>
-      </w:r>
-      <w:r>
-        <w:rPr>
-          <w:rStyle w:val="VerbatimChar"/>
-        </w:rPr>
-        <w:t xml:space="preserve">├── .github/workflows/ci-cd.yml</w:t>
-      </w:r>
-      <w:r>
-        <w:br/>
-      </w:r>
-      <w:r>
-        <w:rPr>
-          <w:rStyle w:val="VerbatimChar"/>
-        </w:rPr>
-        <w:t xml:space="preserve">├── api/</w:t>
-      </w:r>
-      <w:r>
-        <w:br/>
-      </w:r>
-      <w:r>
-        <w:rPr>
-          <w:rStyle w:val="VerbatimChar"/>
-        </w:rPr>
-        <w:t xml:space="preserve">├── data/</w:t>
-      </w:r>
-      <w:r>
-        <w:br/>
-      </w:r>
-      <w:r>
-        <w:rPr>
-          <w:rStyle w:val="VerbatimChar"/>
-        </w:rPr>
-        <w:t xml:space="preserve">├── deployment/</w:t>
-      </w:r>
-      <w:r>
-        <w:br/>
-      </w:r>
-      <w:r>
-        <w:rPr>
-          <w:rStyle w:val="VerbatimChar"/>
-        </w:rPr>
-        <w:t xml:space="preserve">├── models/</w:t>
-      </w:r>
-      <w:r>
-        <w:br/>
-      </w:r>
-      <w:r>
-        <w:rPr>
-          <w:rStyle w:val="VerbatimChar"/>
-        </w:rPr>
-        <w:t xml:space="preserve">├── notebooks/</w:t>
-      </w:r>
-      <w:r>
-        <w:br/>
-      </w:r>
-      <w:r>
-        <w:rPr>
-          <w:rStyle w:val="VerbatimChar"/>
-        </w:rPr>
-        <w:t xml:space="preserve">├── screenshots/</w:t>
-      </w:r>
-      <w:r>
-        <w:br/>
-      </w:r>
-      <w:r>
-        <w:rPr>
-          <w:rStyle w:val="VerbatimChar"/>
-        </w:rPr>
-        <w:t xml:space="preserve">├── src/</w:t>
-      </w:r>
-      <w:r>
-        <w:br/>
-      </w:r>
-      <w:r>
-        <w:rPr>
-          <w:rStyle w:val="VerbatimChar"/>
-        </w:rPr>
-        <w:t xml:space="preserve">├── tests/</w:t>
-      </w:r>
-      <w:r>
-        <w:br/>
-      </w:r>
-      <w:r>
-        <w:rPr>
-          <w:rStyle w:val="VerbatimChar"/>
-        </w:rPr>
-        <w:t xml:space="preserve">├── Dockerfile</w:t>
-      </w:r>
-      <w:r>
-        <w:br/>
-      </w:r>
-      <w:r>
-        <w:rPr>
-          <w:rStyle w:val="VerbatimChar"/>
-        </w:rPr>
-        <w:t xml:space="preserve">├── docker-compose.yml</w:t>
-      </w:r>
-      <w:r>
-        <w:br/>
-      </w:r>
-      <w:r>
-        <w:rPr>
-          <w:rStyle w:val="VerbatimChar"/>
-        </w:rPr>
-        <w:t xml:space="preserve">├── README.md</w:t>
-      </w:r>
-      <w:r>
-        <w:br/>
-      </w:r>
-      <w:r>
-        <w:rPr>
-          <w:rStyle w:val="VerbatimChar"/>
-        </w:rPr>
-        <w:t xml:space="preserve">├── REPORT.md</w:t>
-      </w:r>
-      <w:r>
-        <w:br/>
-      </w:r>
-      <w:r>
-        <w:rPr>
-          <w:rStyle w:val="VerbatimChar"/>
-        </w:rPr>
-        <w:t xml:space="preserve">└── requirements.txt</w:t>
-      </w:r>
-    </w:p>
-    <w:bookmarkEnd w:id="65"/>
-    <w:bookmarkStart w:id="66" w:name="b.-links"/>
-    <w:p>
-      <w:pPr>
-        <w:pStyle w:val="Heading3"/>
-      </w:pPr>
-      <w:r>
-        <w:t xml:space="preserve">B. Links</w:t>
-      </w:r>
-    </w:p>
-    <w:p>
-      <w:pPr>
-        <w:pStyle w:val="Compact"/>
-        <w:numPr>
-          <w:ilvl w:val="0"/>
-          <w:numId w:val="1012"/>
-        </w:numPr>
-      </w:pPr>
-      <w:r>
-        <w:rPr>
-          <w:b/>
-          <w:bCs/>
-        </w:rPr>
-        <w:t xml:space="preserve">Repository</w:t>
-      </w:r>
-      <w:r>
-        <w:t xml:space="preserve">: https://github.com/gaur-samal/MLOps_assignment_2025cs05001</w:t>
-      </w:r>
-    </w:p>
-    <w:p>
-      <w:pPr>
-        <w:pStyle w:val="Compact"/>
-        <w:numPr>
-          <w:ilvl w:val="0"/>
-          <w:numId w:val="1012"/>
-        </w:numPr>
-      </w:pPr>
-      <w:r>
-        <w:rPr>
-          <w:b/>
-          <w:bCs/>
-        </w:rPr>
-        <w:t xml:space="preserve">CI/CD Pipeline</w:t>
-      </w:r>
-      <w:r>
-        <w:t xml:space="preserve">: https://github.com/gaur-samal/MLOps_assignment_2025cs05001/actions</w:t>
-      </w:r>
-    </w:p>
-    <w:p>
-      <w:pPr>
-        <w:pStyle w:val="Compact"/>
-        <w:numPr>
-          <w:ilvl w:val="0"/>
-          <w:numId w:val="1012"/>
-        </w:numPr>
-      </w:pPr>
-      <w:r>
-        <w:rPr>
-          <w:b/>
-          <w:bCs/>
-        </w:rPr>
-        <w:t xml:space="preserve">API Documentation</w:t>
-      </w:r>
-      <w:r>
-        <w:t xml:space="preserve">: http://localhost:8000/docs</w:t>
-      </w:r>
-    </w:p>
-    <w:p>
-      <w:pPr>
-        <w:pStyle w:val="Compact"/>
-        <w:numPr>
-          <w:ilvl w:val="0"/>
-          <w:numId w:val="1012"/>
-        </w:numPr>
-      </w:pPr>
-      <w:r>
-        <w:rPr>
-          <w:b/>
-          <w:bCs/>
-        </w:rPr>
-        <w:t xml:space="preserve">MLflow UI</w:t>
-      </w:r>
-      <w:r>
-        <w:t xml:space="preserve">: http://localhost:5000</w:t>
-      </w:r>
-    </w:p>
-    <w:p>
-      <w:r>
-        <w:pict>
-          <v:rect style="width:0;height:1.5pt" o:hralign="center" o:hrstd="t" o:hr="t"/>
-        </w:pict>
-      </w:r>
-    </w:p>
     <w:p>
       <w:pPr>
         <w:pStyle w:val="FirstParagraph"/>
@@ -7990,9 +7896,9 @@
         <w:t xml:space="preserve">Report generated for MLOps Assignment I</w:t>
       </w:r>
     </w:p>
+    <w:bookmarkEnd w:id="65"/>
     <w:bookmarkEnd w:id="66"/>
     <w:bookmarkEnd w:id="67"/>
-    <w:bookmarkEnd w:id="68"/>
     <w:sectPr>
       <w:footnotePr>
         <w:numRestart w:val="eachSect"/>
@@ -8514,36 +8420,6 @@
     </w:lvlOverride>
   </w:num>
   <w:num w:numId="1011">
-    <w:abstractNumId w:val="99411"/>
-    <w:lvlOverride w:ilvl="0">
-      <w:startOverride w:val="1"/>
-    </w:lvlOverride>
-    <w:lvlOverride w:ilvl="1">
-      <w:startOverride w:val="1"/>
-    </w:lvlOverride>
-    <w:lvlOverride w:ilvl="2">
-      <w:startOverride w:val="1"/>
-    </w:lvlOverride>
-    <w:lvlOverride w:ilvl="3">
-      <w:startOverride w:val="1"/>
-    </w:lvlOverride>
-    <w:lvlOverride w:ilvl="4">
-      <w:startOverride w:val="1"/>
-    </w:lvlOverride>
-    <w:lvlOverride w:ilvl="5">
-      <w:startOverride w:val="1"/>
-    </w:lvlOverride>
-    <w:lvlOverride w:ilvl="6">
-      <w:startOverride w:val="1"/>
-    </w:lvlOverride>
-    <w:lvlOverride w:ilvl="7">
-      <w:startOverride w:val="1"/>
-    </w:lvlOverride>
-    <w:lvlOverride w:ilvl="8">
-      <w:startOverride w:val="1"/>
-    </w:lvlOverride>
-  </w:num>
-  <w:num w:numId="1012">
     <w:abstractNumId w:val="991"/>
   </w:num>
 </w:numbering>

</xml_diff>

<commit_message>
Fix: update MLflow UI command with --host 127.0.0.1, remove XGBoost from notebook
</commit_message>
<xml_diff>
--- a/REPORT.docx
+++ b/REPORT.docx
@@ -2898,7 +2898,28 @@
         <w:rPr>
           <w:rStyle w:val="NormalTok"/>
         </w:rPr>
-        <w:t xml:space="preserve"> 5000</w:t>
+        <w:t xml:space="preserve"> 5000 </w:t>
+      </w:r>
+      <w:r>
+        <w:rPr>
+          <w:rStyle w:val="AttributeTok"/>
+        </w:rPr>
+        <w:t xml:space="preserve">--host</w:t>
+      </w:r>
+      <w:r>
+        <w:rPr>
+          <w:rStyle w:val="NormalTok"/>
+        </w:rPr>
+        <w:t xml:space="preserve"> 127.0.0.1</w:t>
+      </w:r>
+      <w:r>
+        <w:br/>
+      </w:r>
+      <w:r>
+        <w:rPr>
+          <w:rStyle w:val="CommentTok"/>
+        </w:rPr>
+        <w:t xml:space="preserve"># Open http://127.0.0.1:5000 in browser</w:t>
       </w:r>
     </w:p>
     <w:bookmarkEnd w:id="27"/>
@@ -7012,31 +7033,13 @@
         <w:rPr>
           <w:rStyle w:val="ExtensionTok"/>
         </w:rPr>
-        <w:t xml:space="preserve">python</w:t>
-      </w:r>
-      <w:r>
-        <w:rPr>
-          <w:rStyle w:val="NormalTok"/>
-        </w:rPr>
-        <w:t xml:space="preserve"> </w:t>
-      </w:r>
-      <w:r>
-        <w:rPr>
-          <w:rStyle w:val="AttributeTok"/>
-        </w:rPr>
-        <w:t xml:space="preserve">-c</w:t>
-      </w:r>
-      <w:r>
-        <w:rPr>
-          <w:rStyle w:val="NormalTok"/>
-        </w:rPr>
-        <w:t xml:space="preserve"> </w:t>
-      </w:r>
-      <w:r>
-        <w:rPr>
-          <w:rStyle w:val="StringTok"/>
-        </w:rPr>
-        <w:t xml:space="preserve">"exec(open('notebooks/02_model_training.ipynb').read())"</w:t>
+        <w:t xml:space="preserve">jupyter</w:t>
+      </w:r>
+      <w:r>
+        <w:rPr>
+          <w:rStyle w:val="NormalTok"/>
+        </w:rPr>
+        <w:t xml:space="preserve"> notebook notebooks/02_model_training.ipynb</w:t>
       </w:r>
       <w:r>
         <w:br/>
@@ -7874,7 +7877,7 @@
         <w:t xml:space="preserve">MLflow UI</w:t>
       </w:r>
       <w:r>
-        <w:t xml:space="preserve">: http://localhost:5000</w:t>
+        <w:t xml:space="preserve">: http://127.0.0.1:5000</w:t>
       </w:r>
     </w:p>
     <w:p>

</xml_diff>

<commit_message>
Add architecture diagram PNG image to report
</commit_message>
<xml_diff>
--- a/REPORT.docx
+++ b/REPORT.docx
@@ -28,7 +28,7 @@
         </w:p>
       </w:sdtContent>
     </w:sdt>
-    <w:bookmarkStart w:id="67" w:name="mlops-assignment-report"/>
+    <w:bookmarkStart w:id="70" w:name="mlops-assignment-report"/>
     <w:p>
       <w:pPr>
         <w:pStyle w:val="Heading1"/>
@@ -6255,7 +6255,7 @@
     </w:p>
     <w:bookmarkEnd w:id="52"/>
     <w:bookmarkEnd w:id="53"/>
-    <w:bookmarkStart w:id="54" w:name="architecture-diagram"/>
+    <w:bookmarkStart w:id="57" w:name="architecture-diagram"/>
     <w:p>
       <w:pPr>
         <w:pStyle w:val="Heading2"/>
@@ -6266,474 +6266,356 @@
     </w:p>
     <w:p>
       <w:pPr>
-        <w:pStyle w:val="SourceCode"/>
-      </w:pPr>
-      <w:r>
-        <w:rPr>
-          <w:rStyle w:val="VerbatimChar"/>
-        </w:rPr>
-        <w:t xml:space="preserve">┌─────────────────────────────────────────────────────────────────────────┐</w:t>
-      </w:r>
-      <w:r>
-        <w:br/>
-      </w:r>
-      <w:r>
-        <w:rPr>
-          <w:rStyle w:val="VerbatimChar"/>
-        </w:rPr>
-        <w:t xml:space="preserve">│                              GITHUB                                      │</w:t>
-      </w:r>
-      <w:r>
-        <w:br/>
-      </w:r>
-      <w:r>
-        <w:rPr>
-          <w:rStyle w:val="VerbatimChar"/>
-        </w:rPr>
-        <w:t xml:space="preserve">│  ┌─────────────┐                                                        │</w:t>
-      </w:r>
-      <w:r>
-        <w:br/>
-      </w:r>
-      <w:r>
-        <w:rPr>
-          <w:rStyle w:val="VerbatimChar"/>
-        </w:rPr>
-        <w:t xml:space="preserve">│  │  Repository │──────────────┐                                         │</w:t>
-      </w:r>
-      <w:r>
-        <w:br/>
-      </w:r>
-      <w:r>
-        <w:rPr>
-          <w:rStyle w:val="VerbatimChar"/>
-        </w:rPr>
-        <w:t xml:space="preserve">│  └─────────────┘              │                                         │</w:t>
-      </w:r>
-      <w:r>
-        <w:br/>
-      </w:r>
-      <w:r>
-        <w:rPr>
-          <w:rStyle w:val="VerbatimChar"/>
-        </w:rPr>
-        <w:t xml:space="preserve">│         │                     ▼                                         │</w:t>
-      </w:r>
-      <w:r>
-        <w:br/>
-      </w:r>
-      <w:r>
-        <w:rPr>
-          <w:rStyle w:val="VerbatimChar"/>
-        </w:rPr>
-        <w:t xml:space="preserve">│         │            ┌─────────────────┐                                │</w:t>
-      </w:r>
-      <w:r>
-        <w:br/>
-      </w:r>
-      <w:r>
-        <w:rPr>
-          <w:rStyle w:val="VerbatimChar"/>
-        </w:rPr>
-        <w:t xml:space="preserve">│         │            │  GitHub Actions │                                │</w:t>
-      </w:r>
-      <w:r>
-        <w:br/>
-      </w:r>
-      <w:r>
-        <w:rPr>
-          <w:rStyle w:val="VerbatimChar"/>
-        </w:rPr>
-        <w:t xml:space="preserve">│         │            │    CI/CD        │                                │</w:t>
-      </w:r>
-      <w:r>
-        <w:br/>
-      </w:r>
-      <w:r>
-        <w:rPr>
-          <w:rStyle w:val="VerbatimChar"/>
-        </w:rPr>
-        <w:t xml:space="preserve">│         │            └────────┬────────┘                                │</w:t>
-      </w:r>
-      <w:r>
-        <w:br/>
-      </w:r>
-      <w:r>
-        <w:rPr>
-          <w:rStyle w:val="VerbatimChar"/>
-        </w:rPr>
-        <w:t xml:space="preserve">│         │                     │                                         │</w:t>
-      </w:r>
-      <w:r>
-        <w:br/>
-      </w:r>
-      <w:r>
-        <w:rPr>
-          <w:rStyle w:val="VerbatimChar"/>
-        </w:rPr>
-        <w:t xml:space="preserve">└─────────┼─────────────────────┼─────────────────────────────────────────┘</w:t>
-      </w:r>
-      <w:r>
-        <w:br/>
-      </w:r>
-      <w:r>
-        <w:rPr>
-          <w:rStyle w:val="VerbatimChar"/>
-        </w:rPr>
-        <w:t xml:space="preserve">          │                     │</w:t>
-      </w:r>
-      <w:r>
-        <w:br/>
-      </w:r>
-      <w:r>
-        <w:rPr>
-          <w:rStyle w:val="VerbatimChar"/>
-        </w:rPr>
-        <w:t xml:space="preserve">          │   ┌─────────────────┼─────────────────┐</w:t>
-      </w:r>
-      <w:r>
-        <w:br/>
-      </w:r>
-      <w:r>
-        <w:rPr>
-          <w:rStyle w:val="VerbatimChar"/>
-        </w:rPr>
-        <w:t xml:space="preserve">          │   │                 ▼                 │</w:t>
-      </w:r>
-      <w:r>
-        <w:br/>
-      </w:r>
-      <w:r>
-        <w:rPr>
-          <w:rStyle w:val="VerbatimChar"/>
-        </w:rPr>
-        <w:t xml:space="preserve">          │   │  ┌──────────────────────────┐    │</w:t>
-      </w:r>
-      <w:r>
-        <w:br/>
-      </w:r>
-      <w:r>
-        <w:rPr>
-          <w:rStyle w:val="VerbatimChar"/>
-        </w:rPr>
-        <w:t xml:space="preserve">          │   │  │   Container Registry     │    │</w:t>
-      </w:r>
-      <w:r>
-        <w:br/>
-      </w:r>
-      <w:r>
-        <w:rPr>
-          <w:rStyle w:val="VerbatimChar"/>
-        </w:rPr>
-        <w:t xml:space="preserve">          │   │  │   (Docker Hub/GHCR)      │    │</w:t>
-      </w:r>
-      <w:r>
-        <w:br/>
-      </w:r>
-      <w:r>
-        <w:rPr>
-          <w:rStyle w:val="VerbatimChar"/>
-        </w:rPr>
-        <w:t xml:space="preserve">          │   │  └───────────┬──────────────┘    │</w:t>
-      </w:r>
-      <w:r>
-        <w:br/>
-      </w:r>
-      <w:r>
-        <w:rPr>
-          <w:rStyle w:val="VerbatimChar"/>
-        </w:rPr>
-        <w:t xml:space="preserve">          │   │              │                    │</w:t>
-      </w:r>
-      <w:r>
-        <w:br/>
-      </w:r>
-      <w:r>
-        <w:rPr>
-          <w:rStyle w:val="VerbatimChar"/>
-        </w:rPr>
-        <w:t xml:space="preserve">          │   │              ▼                    │</w:t>
-      </w:r>
-      <w:r>
-        <w:br/>
-      </w:r>
-      <w:r>
-        <w:rPr>
-          <w:rStyle w:val="VerbatimChar"/>
-        </w:rPr>
-        <w:t xml:space="preserve">          │   │  ┌─────────────────────────────┐ │</w:t>
-      </w:r>
-      <w:r>
-        <w:br/>
-      </w:r>
-      <w:r>
-        <w:rPr>
-          <w:rStyle w:val="VerbatimChar"/>
-        </w:rPr>
-        <w:t xml:space="preserve">          │   │  │     KUBERNETES CLUSTER      │ │</w:t>
-      </w:r>
-      <w:r>
-        <w:br/>
-      </w:r>
-      <w:r>
-        <w:rPr>
-          <w:rStyle w:val="VerbatimChar"/>
-        </w:rPr>
-        <w:t xml:space="preserve">          │   │  │  ┌───────────────────────┐  │ │</w:t>
-      </w:r>
-      <w:r>
-        <w:br/>
-      </w:r>
-      <w:r>
-        <w:rPr>
-          <w:rStyle w:val="VerbatimChar"/>
-        </w:rPr>
-        <w:t xml:space="preserve">          │   │  │  │       Ingress         │  │ │</w:t>
-      </w:r>
-      <w:r>
-        <w:br/>
-      </w:r>
-      <w:r>
-        <w:rPr>
-          <w:rStyle w:val="VerbatimChar"/>
-        </w:rPr>
-        <w:t xml:space="preserve">          │   │  │  └──────────┬────────────┘  │ │</w:t>
-      </w:r>
-      <w:r>
-        <w:br/>
-      </w:r>
-      <w:r>
-        <w:rPr>
-          <w:rStyle w:val="VerbatimChar"/>
-        </w:rPr>
-        <w:t xml:space="preserve">          │   │  │             │               │ │</w:t>
-      </w:r>
-      <w:r>
-        <w:br/>
-      </w:r>
-      <w:r>
-        <w:rPr>
-          <w:rStyle w:val="VerbatimChar"/>
-        </w:rPr>
-        <w:t xml:space="preserve">          │   │  │  ┌──────────▼────────────┐  │ │</w:t>
-      </w:r>
-      <w:r>
-        <w:br/>
-      </w:r>
-      <w:r>
-        <w:rPr>
-          <w:rStyle w:val="VerbatimChar"/>
-        </w:rPr>
-        <w:t xml:space="preserve">          │   │  │  │       Service         │  │ │</w:t>
-      </w:r>
-      <w:r>
-        <w:br/>
-      </w:r>
-      <w:r>
-        <w:rPr>
-          <w:rStyle w:val="VerbatimChar"/>
-        </w:rPr>
-        <w:t xml:space="preserve">          │   │  │  └──────────┬────────────┘  │ │</w:t>
-      </w:r>
-      <w:r>
-        <w:br/>
-      </w:r>
-      <w:r>
-        <w:rPr>
-          <w:rStyle w:val="VerbatimChar"/>
-        </w:rPr>
-        <w:t xml:space="preserve">          │   │  │             │               │ │</w:t>
-      </w:r>
-      <w:r>
-        <w:br/>
-      </w:r>
-      <w:r>
-        <w:rPr>
-          <w:rStyle w:val="VerbatimChar"/>
-        </w:rPr>
-        <w:t xml:space="preserve">          │   │  │  ┌──────────▼────────────┐  │ │</w:t>
-      </w:r>
-      <w:r>
-        <w:br/>
-      </w:r>
-      <w:r>
-        <w:rPr>
-          <w:rStyle w:val="VerbatimChar"/>
-        </w:rPr>
-        <w:t xml:space="preserve">          │   │  │  │     Deployment        │  │ │</w:t>
-      </w:r>
-      <w:r>
-        <w:br/>
-      </w:r>
-      <w:r>
-        <w:rPr>
-          <w:rStyle w:val="VerbatimChar"/>
-        </w:rPr>
-        <w:t xml:space="preserve">          │   │  │  │  ┌────┐ ┌────┐ ┌────┐ │  │ │</w:t>
-      </w:r>
-      <w:r>
-        <w:br/>
-      </w:r>
-      <w:r>
-        <w:rPr>
-          <w:rStyle w:val="VerbatimChar"/>
-        </w:rPr>
-        <w:t xml:space="preserve">          │   │  │  │  │Pod │ │Pod │ │Pod │ │  │ │</w:t>
-      </w:r>
-      <w:r>
-        <w:br/>
-      </w:r>
-      <w:r>
-        <w:rPr>
-          <w:rStyle w:val="VerbatimChar"/>
-        </w:rPr>
-        <w:t xml:space="preserve">          │   │  │  │  └────┘ └────┘ └────┘ │  │ │</w:t>
-      </w:r>
-      <w:r>
-        <w:br/>
-      </w:r>
-      <w:r>
-        <w:rPr>
-          <w:rStyle w:val="VerbatimChar"/>
-        </w:rPr>
-        <w:t xml:space="preserve">          │   │  │  └───────────────────────┘  │ │</w:t>
-      </w:r>
-      <w:r>
-        <w:br/>
-      </w:r>
-      <w:r>
-        <w:rPr>
-          <w:rStyle w:val="VerbatimChar"/>
-        </w:rPr>
-        <w:t xml:space="preserve">          │   │  │                             │ │</w:t>
-      </w:r>
-      <w:r>
-        <w:br/>
-      </w:r>
-      <w:r>
-        <w:rPr>
-          <w:rStyle w:val="VerbatimChar"/>
-        </w:rPr>
-        <w:t xml:space="preserve">          │   │  │  ┌───────────────────────┐  │ │</w:t>
-      </w:r>
-      <w:r>
-        <w:br/>
-      </w:r>
-      <w:r>
-        <w:rPr>
-          <w:rStyle w:val="VerbatimChar"/>
-        </w:rPr>
-        <w:t xml:space="preserve">          │   │  │  │     Monitoring        │  │ │</w:t>
-      </w:r>
-      <w:r>
-        <w:br/>
-      </w:r>
-      <w:r>
-        <w:rPr>
-          <w:rStyle w:val="VerbatimChar"/>
-        </w:rPr>
-        <w:t xml:space="preserve">          │   │  │  │  Prometheus + Grafana │  │ │</w:t>
-      </w:r>
-      <w:r>
-        <w:br/>
-      </w:r>
-      <w:r>
-        <w:rPr>
-          <w:rStyle w:val="VerbatimChar"/>
-        </w:rPr>
-        <w:t xml:space="preserve">          │   │  │  └───────────────────────┘  │ │</w:t>
-      </w:r>
-      <w:r>
-        <w:br/>
-      </w:r>
-      <w:r>
-        <w:rPr>
-          <w:rStyle w:val="VerbatimChar"/>
-        </w:rPr>
-        <w:t xml:space="preserve">          │   │  └─────────────────────────────┘ │</w:t>
-      </w:r>
-      <w:r>
-        <w:br/>
-      </w:r>
-      <w:r>
-        <w:rPr>
-          <w:rStyle w:val="VerbatimChar"/>
-        </w:rPr>
-        <w:t xml:space="preserve">          │   │                                   │</w:t>
-      </w:r>
-      <w:r>
-        <w:br/>
-      </w:r>
-      <w:r>
-        <w:rPr>
-          <w:rStyle w:val="VerbatimChar"/>
-        </w:rPr>
-        <w:t xml:space="preserve">          │   │         CLOUD / MINIKUBE          │</w:t>
-      </w:r>
-      <w:r>
-        <w:br/>
-      </w:r>
-      <w:r>
-        <w:rPr>
-          <w:rStyle w:val="VerbatimChar"/>
-        </w:rPr>
-        <w:t xml:space="preserve">          │   └───────────────────────────────────┘</w:t>
-      </w:r>
-      <w:r>
-        <w:br/>
-      </w:r>
-      <w:r>
-        <w:rPr>
-          <w:rStyle w:val="VerbatimChar"/>
-        </w:rPr>
-        <w:t xml:space="preserve">          │</w:t>
-      </w:r>
-      <w:r>
-        <w:br/>
-      </w:r>
-      <w:r>
-        <w:rPr>
-          <w:rStyle w:val="VerbatimChar"/>
-        </w:rPr>
-        <w:t xml:space="preserve">          ▼</w:t>
-      </w:r>
-      <w:r>
-        <w:br/>
-      </w:r>
-      <w:r>
-        <w:rPr>
-          <w:rStyle w:val="VerbatimChar"/>
-        </w:rPr>
-        <w:t xml:space="preserve">    ┌───────────────┐</w:t>
-      </w:r>
-      <w:r>
-        <w:br/>
-      </w:r>
-      <w:r>
-        <w:rPr>
-          <w:rStyle w:val="VerbatimChar"/>
-        </w:rPr>
-        <w:t xml:space="preserve">    │    MLflow     │</w:t>
-      </w:r>
-      <w:r>
-        <w:br/>
-      </w:r>
-      <w:r>
-        <w:rPr>
-          <w:rStyle w:val="VerbatimChar"/>
-        </w:rPr>
-        <w:t xml:space="preserve">    │   Tracking    │</w:t>
-      </w:r>
-      <w:r>
-        <w:br/>
-      </w:r>
-      <w:r>
-        <w:rPr>
-          <w:rStyle w:val="VerbatimChar"/>
-        </w:rPr>
-        <w:t xml:space="preserve">    └───────────────┘</w:t>
-      </w:r>
-    </w:p>
+        <w:pStyle w:val="CaptionedFigure"/>
+      </w:pPr>
+      <w:r>
+        <w:drawing>
+          <wp:inline>
+            <wp:extent cx="5334000" cy="5018645"/>
+            <wp:effectExtent b="0" l="0" r="0" t="0"/>
+            <wp:docPr descr="MLOps Heart Disease Prediction Architecture" title="" id="55" name="Picture"/>
+            <a:graphic>
+              <a:graphicData uri="http://schemas.openxmlformats.org/drawingml/2006/picture">
+                <pic:pic>
+                  <pic:nvPicPr>
+                    <pic:cNvPr descr="screenshots/architecture_diagram.png" id="56" name="Picture"/>
+                    <pic:cNvPicPr>
+                      <a:picLocks noChangeArrowheads="1" noChangeAspect="1"/>
+                    </pic:cNvPicPr>
+                  </pic:nvPicPr>
+                  <pic:blipFill>
+                    <a:blip r:embed="rId54"/>
+                    <a:stretch>
+                      <a:fillRect/>
+                    </a:stretch>
+                  </pic:blipFill>
+                  <pic:spPr bwMode="auto">
+                    <a:xfrm>
+                      <a:off x="0" y="0"/>
+                      <a:ext cx="5334000" cy="5018645"/>
+                    </a:xfrm>
+                    <a:prstGeom prst="rect">
+                      <a:avLst/>
+                    </a:prstGeom>
+                    <a:noFill/>
+                    <a:ln w="9525">
+                      <a:noFill/>
+                      <a:headEnd/>
+                      <a:tailEnd/>
+                    </a:ln>
+                  </pic:spPr>
+                </pic:pic>
+              </a:graphicData>
+            </a:graphic>
+          </wp:inline>
+        </w:drawing>
+      </w:r>
+    </w:p>
+    <w:p>
+      <w:pPr>
+        <w:pStyle w:val="ImageCaption"/>
+      </w:pPr>
+      <w:r>
+        <w:t xml:space="preserve">MLOps Heart Disease Prediction Architecture</w:t>
+      </w:r>
+    </w:p>
+    <w:p>
+      <w:pPr>
+        <w:pStyle w:val="BodyText"/>
+      </w:pPr>
+      <w:r>
+        <w:rPr>
+          <w:b/>
+          <w:bCs/>
+        </w:rPr>
+        <w:t xml:space="preserve">System Components:</w:t>
+      </w:r>
+    </w:p>
+    <w:tbl>
+      <w:tblPr>
+        <w:tblStyle w:val="Table"/>
+        <w:tblW w:type="pct" w:w="5000"/>
+        <w:tblLayout w:type="fixed"/>
+        <w:tblLook w:firstRow="1" w:lastRow="0" w:firstColumn="0" w:lastColumn="0" w:noHBand="0" w:noVBand="0" w:val="0020"/>
+      </w:tblPr>
+      <w:tblGrid>
+        <w:gridCol w:w="1788"/>
+        <w:gridCol w:w="2810"/>
+        <w:gridCol w:w="3321"/>
+      </w:tblGrid>
+      <w:tr>
+        <w:trPr>
+          <w:tblHeader w:val="on"/>
+        </w:trPr>
+        <w:tc>
+          <w:tcPr/>
+          <w:p>
+            <w:pPr>
+              <w:pStyle w:val="Compact"/>
+            </w:pPr>
+            <w:r>
+              <w:t xml:space="preserve">Layer</w:t>
+            </w:r>
+          </w:p>
+        </w:tc>
+        <w:tc>
+          <w:tcPr/>
+          <w:p>
+            <w:pPr>
+              <w:pStyle w:val="Compact"/>
+            </w:pPr>
+            <w:r>
+              <w:t xml:space="preserve">Components</w:t>
+            </w:r>
+          </w:p>
+        </w:tc>
+        <w:tc>
+          <w:tcPr/>
+          <w:p>
+            <w:pPr>
+              <w:pStyle w:val="Compact"/>
+            </w:pPr>
+            <w:r>
+              <w:t xml:space="preserve">Description</w:t>
+            </w:r>
+          </w:p>
+        </w:tc>
+      </w:tr>
+      <w:tr>
+        <w:tc>
+          <w:tcPr/>
+          <w:p>
+            <w:pPr>
+              <w:pStyle w:val="Compact"/>
+            </w:pPr>
+            <w:r>
+              <w:rPr>
+                <w:b/>
+                <w:bCs/>
+              </w:rPr>
+              <w:t xml:space="preserve">Data Layer</w:t>
+            </w:r>
+          </w:p>
+        </w:tc>
+        <w:tc>
+          <w:tcPr/>
+          <w:p>
+            <w:pPr>
+              <w:pStyle w:val="Compact"/>
+            </w:pPr>
+            <w:r>
+              <w:t xml:space="preserve">Raw Data → Cleaning → Feature Engineering</w:t>
+            </w:r>
+          </w:p>
+        </w:tc>
+        <w:tc>
+          <w:tcPr/>
+          <w:p>
+            <w:pPr>
+              <w:pStyle w:val="Compact"/>
+            </w:pPr>
+            <w:r>
+              <w:t xml:space="preserve">Processes heart.csv through data_processing.py and feature_engineering.py</w:t>
+            </w:r>
+          </w:p>
+        </w:tc>
+      </w:tr>
+      <w:tr>
+        <w:tc>
+          <w:tcPr/>
+          <w:p>
+            <w:pPr>
+              <w:pStyle w:val="Compact"/>
+            </w:pPr>
+            <w:r>
+              <w:rPr>
+                <w:b/>
+                <w:bCs/>
+              </w:rPr>
+              <w:t xml:space="preserve">Model Layer</w:t>
+            </w:r>
+          </w:p>
+        </w:tc>
+        <w:tc>
+          <w:tcPr/>
+          <w:p>
+            <w:pPr>
+              <w:pStyle w:val="Compact"/>
+            </w:pPr>
+            <w:r>
+              <w:t xml:space="preserve">Training → Tuning → MLflow Tracking</w:t>
+            </w:r>
+          </w:p>
+        </w:tc>
+        <w:tc>
+          <w:tcPr/>
+          <w:p>
+            <w:pPr>
+              <w:pStyle w:val="Compact"/>
+            </w:pPr>
+            <w:r>
+              <w:t xml:space="preserve">Logistic Regression, Random Forest, Gradient Boosting with GridSearchCV</w:t>
+            </w:r>
+          </w:p>
+        </w:tc>
+      </w:tr>
+      <w:tr>
+        <w:tc>
+          <w:tcPr/>
+          <w:p>
+            <w:pPr>
+              <w:pStyle w:val="Compact"/>
+            </w:pPr>
+            <w:r>
+              <w:rPr>
+                <w:b/>
+                <w:bCs/>
+              </w:rPr>
+              <w:t xml:space="preserve">API Layer</w:t>
+            </w:r>
+          </w:p>
+        </w:tc>
+        <w:tc>
+          <w:tcPr/>
+          <w:p>
+            <w:pPr>
+              <w:pStyle w:val="Compact"/>
+            </w:pPr>
+            <w:r>
+              <w:t xml:space="preserve">FastAPI Application</w:t>
+            </w:r>
+          </w:p>
+        </w:tc>
+        <w:tc>
+          <w:tcPr/>
+          <w:p>
+            <w:pPr>
+              <w:pStyle w:val="Compact"/>
+            </w:pPr>
+            <w:r>
+              <w:t xml:space="preserve">Endpoints: /health, /predict, /features, /metrics</w:t>
+            </w:r>
+          </w:p>
+        </w:tc>
+      </w:tr>
+      <w:tr>
+        <w:tc>
+          <w:tcPr/>
+          <w:p>
+            <w:pPr>
+              <w:pStyle w:val="Compact"/>
+            </w:pPr>
+            <w:r>
+              <w:rPr>
+                <w:b/>
+                <w:bCs/>
+              </w:rPr>
+              <w:t xml:space="preserve">Container Layer</w:t>
+            </w:r>
+          </w:p>
+        </w:tc>
+        <w:tc>
+          <w:tcPr/>
+          <w:p>
+            <w:pPr>
+              <w:pStyle w:val="Compact"/>
+            </w:pPr>
+            <w:r>
+              <w:t xml:space="preserve">Docker Container</w:t>
+            </w:r>
+          </w:p>
+        </w:tc>
+        <w:tc>
+          <w:tcPr/>
+          <w:p>
+            <w:pPr>
+              <w:pStyle w:val="Compact"/>
+            </w:pPr>
+            <w:r>
+              <w:t xml:space="preserve">Python 3.12 with model.pkl and preprocessor.pkl</w:t>
+            </w:r>
+          </w:p>
+        </w:tc>
+      </w:tr>
+      <w:tr>
+        <w:tc>
+          <w:tcPr/>
+          <w:p>
+            <w:pPr>
+              <w:pStyle w:val="Compact"/>
+            </w:pPr>
+            <w:r>
+              <w:rPr>
+                <w:b/>
+                <w:bCs/>
+              </w:rPr>
+              <w:t xml:space="preserve">Kubernetes Layer</w:t>
+            </w:r>
+          </w:p>
+        </w:tc>
+        <w:tc>
+          <w:tcPr/>
+          <w:p>
+            <w:pPr>
+              <w:pStyle w:val="Compact"/>
+            </w:pPr>
+            <w:r>
+              <w:t xml:space="preserve">Deployment → Service → HPA</w:t>
+            </w:r>
+          </w:p>
+        </w:tc>
+        <w:tc>
+          <w:tcPr/>
+          <w:p>
+            <w:pPr>
+              <w:pStyle w:val="Compact"/>
+            </w:pPr>
+            <w:r>
+              <w:t xml:space="preserve">3 replicas with auto-scaling and ConfigMap</w:t>
+            </w:r>
+          </w:p>
+        </w:tc>
+      </w:tr>
+      <w:tr>
+        <w:tc>
+          <w:tcPr/>
+          <w:p>
+            <w:pPr>
+              <w:pStyle w:val="Compact"/>
+            </w:pPr>
+            <w:r>
+              <w:rPr>
+                <w:b/>
+                <w:bCs/>
+              </w:rPr>
+              <w:t xml:space="preserve">CI/CD Layer</w:t>
+            </w:r>
+          </w:p>
+        </w:tc>
+        <w:tc>
+          <w:tcPr/>
+          <w:p>
+            <w:pPr>
+              <w:pStyle w:val="Compact"/>
+            </w:pPr>
+            <w:r>
+              <w:t xml:space="preserve">Lint → Test → Train → Build → Deploy</w:t>
+            </w:r>
+          </w:p>
+        </w:tc>
+        <w:tc>
+          <w:tcPr/>
+          <w:p>
+            <w:pPr>
+              <w:pStyle w:val="Compact"/>
+            </w:pPr>
+            <w:r>
+              <w:t xml:space="preserve">GitHub Actions pipeline with GHCR deployment</w:t>
+            </w:r>
+          </w:p>
+        </w:tc>
+      </w:tr>
+    </w:tbl>
     <w:p>
       <w:r>
         <w:pict>
@@ -6741,8 +6623,8 @@
         </w:pict>
       </w:r>
     </w:p>
-    <w:bookmarkEnd w:id="54"/>
-    <w:bookmarkStart w:id="59" w:name="setup-instructions"/>
+    <w:bookmarkEnd w:id="57"/>
+    <w:bookmarkStart w:id="62" w:name="setup-instructions"/>
     <w:p>
       <w:pPr>
         <w:pStyle w:val="Heading2"/>
@@ -6751,7 +6633,7 @@
         <w:t xml:space="preserve">11. Setup Instructions</w:t>
       </w:r>
     </w:p>
-    <w:bookmarkStart w:id="55" w:name="prerequisites"/>
+    <w:bookmarkStart w:id="58" w:name="prerequisites"/>
     <w:p>
       <w:pPr>
         <w:pStyle w:val="Heading3"/>
@@ -6808,8 +6690,8 @@
         <w:t xml:space="preserve">Git</w:t>
       </w:r>
     </w:p>
-    <w:bookmarkEnd w:id="55"/>
-    <w:bookmarkStart w:id="56" w:name="local-setup"/>
+    <w:bookmarkEnd w:id="58"/>
+    <w:bookmarkStart w:id="59" w:name="local-setup"/>
     <w:p>
       <w:pPr>
         <w:pStyle w:val="Heading3"/>
@@ -7096,8 +6978,8 @@
         <w:t xml:space="preserve"># Open http://localhost:8000/docs</w:t>
       </w:r>
     </w:p>
-    <w:bookmarkEnd w:id="56"/>
-    <w:bookmarkStart w:id="57" w:name="docker-setup"/>
+    <w:bookmarkEnd w:id="59"/>
+    <w:bookmarkStart w:id="60" w:name="docker-setup"/>
     <w:p>
       <w:pPr>
         <w:pStyle w:val="Heading3"/>
@@ -7186,8 +7068,8 @@
         <w:t xml:space="preserve"># Grafana: http://localhost:3000</w:t>
       </w:r>
     </w:p>
-    <w:bookmarkEnd w:id="57"/>
-    <w:bookmarkStart w:id="58" w:name="kubernetes-setup"/>
+    <w:bookmarkEnd w:id="60"/>
+    <w:bookmarkStart w:id="61" w:name="kubernetes-setup"/>
     <w:p>
       <w:pPr>
         <w:pStyle w:val="Heading3"/>
@@ -7379,9 +7261,9 @@
         </w:pict>
       </w:r>
     </w:p>
-    <w:bookmarkEnd w:id="58"/>
-    <w:bookmarkEnd w:id="59"/>
-    <w:bookmarkStart w:id="63" w:name="conclusion"/>
+    <w:bookmarkEnd w:id="61"/>
+    <w:bookmarkEnd w:id="62"/>
+    <w:bookmarkStart w:id="66" w:name="conclusion"/>
     <w:p>
       <w:pPr>
         <w:pStyle w:val="Heading2"/>
@@ -7398,7 +7280,7 @@
         <w:t xml:space="preserve">This project successfully demonstrates a complete MLOps pipeline for heart disease prediction:</w:t>
       </w:r>
     </w:p>
-    <w:bookmarkStart w:id="60" w:name="key-achievements"/>
+    <w:bookmarkStart w:id="63" w:name="key-achievements"/>
     <w:p>
       <w:pPr>
         <w:pStyle w:val="Heading3"/>
@@ -7502,8 +7384,8 @@
         <w:t xml:space="preserve">: Prometheus metrics and Grafana dashboards</w:t>
       </w:r>
     </w:p>
-    <w:bookmarkEnd w:id="60"/>
-    <w:bookmarkStart w:id="61" w:name="lessons-learned"/>
+    <w:bookmarkEnd w:id="63"/>
+    <w:bookmarkStart w:id="64" w:name="lessons-learned"/>
     <w:p>
       <w:pPr>
         <w:pStyle w:val="Heading3"/>
@@ -7560,8 +7442,8 @@
         <w:t xml:space="preserve">Need for proper monitoring in production ML systems</w:t>
       </w:r>
     </w:p>
-    <w:bookmarkEnd w:id="61"/>
-    <w:bookmarkStart w:id="62" w:name="future-improvements"/>
+    <w:bookmarkEnd w:id="64"/>
+    <w:bookmarkStart w:id="65" w:name="future-improvements"/>
     <w:p>
       <w:pPr>
         <w:pStyle w:val="Heading3"/>
@@ -7637,9 +7519,9 @@
         </w:pict>
       </w:r>
     </w:p>
-    <w:bookmarkEnd w:id="62"/>
-    <w:bookmarkEnd w:id="63"/>
-    <w:bookmarkStart w:id="66" w:name="appendix"/>
+    <w:bookmarkEnd w:id="65"/>
+    <w:bookmarkEnd w:id="66"/>
+    <w:bookmarkStart w:id="69" w:name="appendix"/>
     <w:p>
       <w:pPr>
         <w:pStyle w:val="Heading2"/>
@@ -7648,7 +7530,7 @@
         <w:t xml:space="preserve">Appendix</w:t>
       </w:r>
     </w:p>
-    <w:bookmarkStart w:id="64" w:name="a.-repository-structure"/>
+    <w:bookmarkStart w:id="67" w:name="a.-repository-structure"/>
     <w:p>
       <w:pPr>
         <w:pStyle w:val="Heading3"/>
@@ -7794,8 +7676,8 @@
         <w:t xml:space="preserve">└── requirements.txt</w:t>
       </w:r>
     </w:p>
-    <w:bookmarkEnd w:id="64"/>
-    <w:bookmarkStart w:id="65" w:name="b.-links"/>
+    <w:bookmarkEnd w:id="67"/>
+    <w:bookmarkStart w:id="68" w:name="b.-links"/>
     <w:p>
       <w:pPr>
         <w:pStyle w:val="Heading3"/>
@@ -7899,9 +7781,9 @@
         <w:t xml:space="preserve">Report generated for MLOps Assignment I</w:t>
       </w:r>
     </w:p>
-    <w:bookmarkEnd w:id="65"/>
-    <w:bookmarkEnd w:id="66"/>
-    <w:bookmarkEnd w:id="67"/>
+    <w:bookmarkEnd w:id="68"/>
+    <w:bookmarkEnd w:id="69"/>
+    <w:bookmarkEnd w:id="70"/>
     <w:sectPr>
       <w:footnotePr>
         <w:numRestart w:val="eachSect"/>

</xml_diff>